<commit_message>
fix: remove duplicate page-number fields from merged thesis document
</commit_message>
<xml_diff>
--- a/output/final/thesis_complete_draft.docx
+++ b/output/final/thesis_complete_draft.docx
@@ -673,7 +673,7 @@
           </w:footnotePr>
           <w:pgSz w:w="11906" w:h="16838"/>
           <w:pgMar w:top="1701" w:right="2268" w:bottom="1417" w:left="1417" w:header="720" w:footer="567" w:gutter="0"/>
-          <w:pgNumType w:numFmt="upperRoman"/>
+          <w:pgNumType w:fmt="upperRoman"/>
           <w:cols w:space="720"/>
           <w:bidi/>
           <w:docGrid w:linePitch="360"/>
@@ -3512,7 +3512,7 @@
           </w:footnotePr>
           <w:pgSz w:w="11906" w:h="16838"/>
           <w:pgMar w:top="1701" w:right="2268" w:bottom="1417" w:left="1417" w:header="720" w:footer="567" w:gutter="0"/>
-          <w:pgNumType w:numFmt="hindi" w:start="1"/>
+          <w:pgNumType w:start="1" w:fmt="hindi"/>
           <w:cols w:space="720"/>
           <w:titlePg/>
           <w:bidi/>
@@ -8526,7 +8526,7 @@
           </w:footnotePr>
           <w:pgSz w:w="11906" w:h="16838"/>
           <w:pgMar w:top="1701" w:right="2268" w:bottom="1417" w:left="1417" w:header="720" w:footer="567" w:gutter="0"/>
-          <w:pgNumType w:numFmt="hindi"/>
+          <w:pgNumType w:fmt="hindi"/>
           <w:cols w:space="720"/>
           <w:titlePg/>
           <w:bidi/>
@@ -10644,7 +10644,7 @@
           </w:footnotePr>
           <w:pgSz w:w="11906" w:h="16838"/>
           <w:pgMar w:top="1701" w:right="2268" w:bottom="1417" w:left="1417" w:header="720" w:footer="567" w:gutter="0"/>
-          <w:pgNumType w:numFmt="hindi"/>
+          <w:pgNumType w:fmt="hindi"/>
           <w:cols w:space="720"/>
           <w:titlePg/>
           <w:bidi/>
@@ -22548,7 +22548,7 @@
       </w:footnotePr>
       <w:pgSz w:w="11906" w:h="16838"/>
       <w:pgMar w:top="1701" w:right="2268" w:bottom="1417" w:left="1417" w:header="720" w:footer="567" w:gutter="0"/>
-      <w:pgNumType w:numFmt="hindi"/>
+      <w:pgNumType w:fmt="hindi"/>
       <w:cols w:space="720"/>
       <w:bidi/>
       <w:docGrid w:linePitch="360"/>

</xml_diff>